<commit_message>
Documentazione: corretti i rilievi di valutazione su AD e SD
Activity Diagram (Fig. 9):
- Timer ora usato correttamente: dopo la creazione del Booking, un
  secondo fork fa gareggiare la revisione del guidatore contro un
  timer (24h), con un esito dedicato 'Request expires' se il timer
  scade prima della risposta
- Un solo nodo finale (bersaglio) invece di due: gli esiti confirmed/
  rejected/expired convergono tutti sullo stesso nodo di fine

Sequence Diagram (Fig. 10):
- Il box di attivazione del messaggio 10 (StudentDashboardBoundary)
  e' stato allungato aggiungendo il messaggio di ritorno 'view ready'
  da SearchRideBoundary, invece di disattivarsi immediatamente
- Aggiunta una seconda chiamata asincrona: dopo aver salvato il
  Booking, SearchRideController notifica anche il guidatore (nuovo
  attore Driver) della richiesta pendente, oltre alla notifica gia'
  presente al passeggero
</commit_message>
<xml_diff>
--- a/docs/UniRide_Submission.docx
+++ b/docs/UniRide_Submission.docx
@@ -2638,7 +2638,7 @@
         <w:spacing w:after="160"/>
       </w:pPr>
       <w:r>
-        <w:t xml:space="preserve">The following activity diagram describes the main flow of a booking request, from the ride search to the driver's confirmation or rejection:</w:t>
+        <w:t xml:space="preserve">The following activity diagram describes the main flow of a booking request, from the ride search to the driver's confirmation, rejection, or automatic expiration if no response arrives within 24 hours:</w:t>
       </w:r>
     </w:p>
     <w:p>
@@ -2649,7 +2649,7 @@
       <w:r>
         <w:drawing>
           <wp:inline distT="0" distB="0" distL="0" distR="0">
-            <wp:extent cx="4146193" cy="8500001"/>
+            <wp:extent cx="5154373" cy="8499999"/>
             <wp:effectExtent t="0" r="0" b="0" l="0"/>
             <wp:docPr id="1" name="" descr="" title=""/>
             <wp:cNvGraphicFramePr>
@@ -2674,7 +2674,7 @@
                   <pic:spPr bwMode="auto">
                     <a:xfrm>
                       <a:off x="0" y="0"/>
-                      <a:ext cx="4146193" cy="8500001"/>
+                      <a:ext cx="5154373" cy="8499999"/>
                     </a:xfrm>
                     <a:prstGeom prst="rect">
                       <a:avLst/>
@@ -2717,7 +2717,7 @@
         <w:spacing w:after="160"/>
       </w:pPr>
       <w:r>
-        <w:t xml:space="preserve">The system's main branch is described in the following sequence diagram, extended from login to the booking request: the student logs in (LoginController verifies the credentials via StudentDAO and opens the session), navigates to 'Cerca Passaggio', obtains the available results from RideDAO, and finally selects a ride. SearchRideController validates the request against the session and the Ride's state, reserves the seat, creates a Booking in the REQUESTED state and persists it; the notification to the passenger (Observer Pattern) is modeled as an asynchronous call.</w:t>
+        <w:t xml:space="preserve">The system's main branch is described in the following sequence diagram, extended from login to the booking request: the student logs in (LoginController verifies the credentials via StudentDAO and opens the session), navigates to 'Cerca Passaggio', obtains the available results from RideDAO, and finally selects a ride. SearchRideController validates the request against the session and the Ride's state, reserves the seat, creates a Booking in the REQUESTED state and persists it; the notifications to the passenger and to the driver (Observer Pattern) are both modeled as asynchronous calls.</w:t>
       </w:r>
     </w:p>
     <w:p>
@@ -2728,7 +2728,7 @@
       <w:r>
         <w:drawing>
           <wp:inline distT="0" distB="0" distL="0" distR="0">
-            <wp:extent cx="5715000" cy="3775982"/>
+            <wp:extent cx="5715000" cy="3907194"/>
             <wp:effectExtent t="0" r="0" b="0" l="0"/>
             <wp:docPr id="1" name="" descr="" title=""/>
             <wp:cNvGraphicFramePr>
@@ -2753,7 +2753,7 @@
                   <pic:spPr bwMode="auto">
                     <a:xfrm>
                       <a:off x="0" y="0"/>
-                      <a:ext cx="5715000" cy="3775982"/>
+                      <a:ext cx="5715000" cy="3907194"/>
                     </a:xfrm>
                     <a:prstGeom prst="rect">
                       <a:avLst/>

</xml_diff>

<commit_message>
Documentazione: Activity Diagram (Fig. 9) - timer ricollegato al flusso unico
Il ramo del timer (24h senza risposta) ora rientra nello stesso nodo
decisionale 'Driver response' invece di proseguire per conto proprio
verso un esito separato: il fork apre due flussi concorrenti (revisione
del guidatore / timer) che si ricongiungono in un unico punto prima di
diramarsi nei tre esiti (confirms/rejects/no response), eliminando il
flusso concorrente mai ricollegato segnalato in fase di valutazione.
Pulite anche le frecce con punti di uscita/entrata espliciti su tutto
il diagramma.
</commit_message>
<xml_diff>
--- a/docs/UniRide_Submission.docx
+++ b/docs/UniRide_Submission.docx
@@ -2649,7 +2649,7 @@
       <w:r>
         <w:drawing>
           <wp:inline distT="0" distB="0" distL="0" distR="0">
-            <wp:extent cx="5154373" cy="8499999"/>
+            <wp:extent cx="5213563" cy="8500000"/>
             <wp:effectExtent t="0" r="0" b="0" l="0"/>
             <wp:docPr id="1" name="" descr="" title=""/>
             <wp:cNvGraphicFramePr>
@@ -2674,7 +2674,7 @@
                   <pic:spPr bwMode="auto">
                     <a:xfrm>
                       <a:off x="0" y="0"/>
-                      <a:ext cx="5154373" cy="8499999"/>
+                      <a:ext cx="5213563" cy="8500000"/>
                     </a:xfrm>
                     <a:prstGeom prst="rect">
                       <a:avLst/>

</xml_diff>

<commit_message>
Documentazione: diagrammi e testo allineati alle correzioni della review
- Fig. 2 (VOPC) ridisegnata: ProfileBean nel livello Bean,
  LoginController.getLoggedUserProfile(), le Boundary passano dal Controller
  invece che da Session; validateDate e RideState.fromStatus.
- Fig. 8 (Observer/Strategy) ridisegnata con PassengerBookingObserver.
- Sorgenti Mermaid salvati in docs/diagrams/ (prima non erano nel repo).
- Testo: persistenza selezionabile con -Duniride.persistence, estensione 3e
  sulla data, ProfileBean, Observer reale, RideState.fromStatus, cache Fs
  invalidata dopo un errore, test PasswordHasherTest e CompensationTest;
  nella documentazione tecnica anche PersistenceException e azioni
  compensative, nuovi messaggi d'errore, hash PBKDF2, query IN dei passeggeri.
- Indici aggiornati ai nuovi numeri di pagina; PDF di consegna rigenerato.

Co-Authored-By: Claude Opus 5.5 <noreply@anthropic.com>
</commit_message>
<xml_diff>
--- a/docs/UniRide_Submission.docx
+++ b/docs/UniRide_Submission.docx
@@ -171,7 +171,7 @@
       <w:r>
         <w:t xml:space="preserve">3. DESIGN</w:t>
         <w:ptab w:alignment="right" w:relativeTo="margin" w:leader="dot"/>
-        <w:t xml:space="preserve">8</w:t>
+        <w:t xml:space="preserve">9</w:t>
       </w:r>
     </w:p>
     <w:p>
@@ -182,7 +182,7 @@
       <w:r>
         <w:t xml:space="preserve">3.1. Class Diagram — VOPC (Analysis)</w:t>
         <w:ptab w:alignment="right" w:relativeTo="margin" w:leader="dot"/>
-        <w:t xml:space="preserve">8</w:t>
+        <w:t xml:space="preserve">9</w:t>
       </w:r>
     </w:p>
     <w:p>
@@ -193,7 +193,7 @@
       <w:r>
         <w:t xml:space="preserve">3.2. Class Diagram — Design Level</w:t>
         <w:ptab w:alignment="right" w:relativeTo="margin" w:leader="dot"/>
-        <w:t xml:space="preserve">12</w:t>
+        <w:t xml:space="preserve">14</w:t>
       </w:r>
     </w:p>
     <w:p>
@@ -204,7 +204,7 @@
       <w:r>
         <w:t xml:space="preserve">3.3. Design Patterns</w:t>
         <w:ptab w:alignment="right" w:relativeTo="margin" w:leader="dot"/>
-        <w:t xml:space="preserve">13</w:t>
+        <w:t xml:space="preserve">15</w:t>
       </w:r>
     </w:p>
     <w:p>
@@ -215,7 +215,7 @@
       <w:r>
         <w:t xml:space="preserve">3.4. Activity Diagram</w:t>
         <w:ptab w:alignment="right" w:relativeTo="margin" w:leader="dot"/>
-        <w:t xml:space="preserve">14</w:t>
+        <w:t xml:space="preserve">16</w:t>
       </w:r>
     </w:p>
     <w:p>
@@ -226,7 +226,7 @@
       <w:r>
         <w:t xml:space="preserve">3.5. Sequence Diagram</w:t>
         <w:ptab w:alignment="right" w:relativeTo="margin" w:leader="dot"/>
-        <w:t xml:space="preserve">16</w:t>
+        <w:t xml:space="preserve">18</w:t>
       </w:r>
     </w:p>
     <w:p>
@@ -237,7 +237,7 @@
       <w:r>
         <w:t xml:space="preserve">3.6. State Diagram</w:t>
         <w:ptab w:alignment="right" w:relativeTo="margin" w:leader="dot"/>
-        <w:t xml:space="preserve">16</w:t>
+        <w:t xml:space="preserve">18</w:t>
       </w:r>
     </w:p>
     <w:p>
@@ -248,7 +248,7 @@
       <w:r>
         <w:t xml:space="preserve">4. TESTING</w:t>
         <w:ptab w:alignment="right" w:relativeTo="margin" w:leader="dot"/>
-        <w:t xml:space="preserve">17</w:t>
+        <w:t xml:space="preserve">19</w:t>
       </w:r>
     </w:p>
     <w:p>
@@ -259,7 +259,7 @@
       <w:r>
         <w:t xml:space="preserve">DELIVERABLE LINKS</w:t>
         <w:ptab w:alignment="right" w:relativeTo="margin" w:leader="dot"/>
-        <w:t xml:space="preserve">18</w:t>
+        <w:t xml:space="preserve">20</w:t>
       </w:r>
     </w:p>
     <w:p>
@@ -808,7 +808,7 @@
                 <w:sz w:val="20"/>
                 <w:szCs w:val="20"/>
               </w:rPr>
-              <w:t xml:space="preserve">In-Memory (default) or CSV file system, selectable in Config.PERSISTENCE_TYPE</w:t>
+              <w:t xml:space="preserve">In-Memory (default), CSV file system or H2 relational database, selectable at startup with -Duniride.persistence (Config.PERSISTENCE_TYPE)</w:t>
             </w:r>
           </w:p>
         </w:tc>
@@ -1547,7 +1547,7 @@
         <w:spacing w:after="80"/>
       </w:pPr>
       <w:r>
-        <w:t xml:space="preserve">3) The system validates the mandatory fields, checks that departure and destination do not coincide, that the number of seats is greater than zero, and that the departure time matches the HH:mm format.</w:t>
+        <w:t xml:space="preserve">3) The system validates the mandatory fields, checks that departure and destination do not coincide, that the number of seats is greater than zero, and that the departure time matches the HH:mm format, and that the date is a real calendar date (dd/MM/yyyy) that is not in the past.</w:t>
       </w:r>
     </w:p>
     <w:p>
@@ -1634,6 +1634,19 @@
       </w:pPr>
       <w:r>
         <w:t xml:space="preserve">3d. The departure time is missing or does not match the HH:mm format: the system rejects the input with the message 'Inserisci un orario di partenza valido (formato HH:mm, es. 08:30).'</w:t>
+      </w:r>
+    </w:p>
+    <w:p>
+      <w:pPr>
+        <w:pStyle w:val="ListParagraph"/>
+        <w:numPr>
+          <w:ilvl w:val="0"/>
+          <w:numId w:val="1"/>
+        </w:numPr>
+        <w:spacing w:after="80"/>
+      </w:pPr>
+      <w:r>
+        <w:t xml:space="preserve">3e. The date is missing, is not a real calendar date, or is already in the past: the system rejects the input with the message 'La data del passaggio è obbligatoria.', 'Data non valida: usa il formato gg/mm/aaaa (es. 15/03/2027).' or 'Non si può offrire un passaggio in una data già passata.' respectively.</w:t>
       </w:r>
     </w:p>
     <w:p>
@@ -1952,7 +1965,7 @@
       <w:r>
         <w:drawing>
           <wp:inline distT="0" distB="0" distL="0" distR="0">
-            <wp:extent cx="5715000" cy="3856167"/>
+            <wp:extent cx="5715000" cy="6057608"/>
             <wp:effectExtent t="0" r="0" b="0" l="0"/>
             <wp:docPr id="1" name="" descr="" title=""/>
             <wp:cNvGraphicFramePr>
@@ -1977,7 +1990,7 @@
                   <pic:spPr bwMode="auto">
                     <a:xfrm>
                       <a:off x="0" y="0"/>
-                      <a:ext cx="5715000" cy="3856167"/>
+                      <a:ext cx="5715000" cy="6057608"/>
                     </a:xfrm>
                     <a:prstGeom prst="rect">
                       <a:avLst/>
@@ -2011,7 +2024,7 @@
         <w:spacing w:after="160"/>
       </w:pPr>
       <w:r>
-        <w:t xml:space="preserve">The Boundary layer contains exclusively classes that interact with the user: the JavaFX controllers bound to their respective FXML views exchange only Bean objects with the Control layer, never Entities directly. Each Boundary manages the loading of its own FXML and the Scene swap on the Stage by itself: there is no centralized SceneManager class (CliMain and the various *CLI classes offer an equivalent text-based interface for headless environments, omitted here to keep the diagram readable). The Bean layer holds the DTOs (RideBean, BookingBean, UserBean) that cross the Boundary↔Control boundary: no Entity ever leaves the domain layer toward the UI. The Control layer encapsulates all the business logic: each controller receives Beans from the Boundary, validates them, orchestrates the Entities and delegates persistence to the DAO layer (illustrated separately right after); none of these classes depends on JavaFX, which lets the same controllers serve both the GUI and the CLI without modification. The Session Singleton provides every controller with the identity of the currently authenticated student. Finally, the Entity layer represents the domain classes: Ride is the richest entity, with the list of registered observers and the methods that trigger its own state transitions (bookSeat, cancelSeat, complete, cancel); Booking models the approval status of each individual booking request, without duplicating the seat-reservation logic already handled by Ride.</w:t>
+        <w:t xml:space="preserve">The Boundary layer contains exclusively classes that interact with the user: the JavaFX controllers bound to their respective FXML views exchange only Bean objects with the Control layer, never Entities directly. Each Boundary manages the loading of its own FXML and the Scene swap on the Stage by itself: there is no centralized SceneManager class (CliMain and the various *CLI classes offer an equivalent text-based interface for headless environments, omitted here to keep the diagram readable). The Bean layer holds the DTOs (RideBean, BookingBean, UserBean, ProfileBean) that cross the Boundary↔Control boundary: no Entity ever leaves the domain layer toward the UI. The Control layer encapsulates all the business logic: each controller receives Beans from the Boundary, validates them, orchestrates the Entities and delegates persistence to the DAO layer (illustrated separately right after); none of these classes depends on JavaFX, which lets the same controllers serve both the GUI and the CLI without modification. The Session Singleton provides every controller with the identity of the currently authenticated student. The Boundaries never access it directly: the data they need about the logged-in student (name and home location) are exposed by LoginController.getLoggedUserProfile() as a ProfileBean, which, unlike the Student entity, carries no password. Finally, the Entity layer represents the domain classes: Ride is the richest entity, with the list of registered observers and the methods that trigger its own state transitions (bookSeat, cancelSeat, complete, cancel); Booking models the approval status of each individual booking request, without duplicating the seat-reservation logic already handled by Ride.</w:t>
       </w:r>
     </w:p>
     <w:p>
@@ -2093,7 +2106,7 @@
         <w:spacing w:after="160"/>
       </w:pPr>
       <w:r>
-        <w:t xml:space="preserve">DAOFactory is the single entry point into the persistence layer. It reads the PERSISTENCE_TYPE constant from Config on the first call to getInstance() and caches the corresponding concrete factory, so that every controller in the system receives DAO objects belonging to the same consistent family.</w:t>
+        <w:t xml:space="preserve">DAOFactory is the single entry point into the persistence layer. It reads the PERSISTENCE_TYPE value from Config (resolved once at startup from the uniride.persistence system property, In-Memory by default) on the first call to getInstance() and caches the corresponding concrete factory, so that every controller in the system receives DAO objects belonging to the same consistent family.</w:t>
       </w:r>
     </w:p>
     <w:p>
@@ -2257,7 +2270,7 @@
         <w:spacing w:after="160"/>
       </w:pPr>
       <w:r>
-        <w:t xml:space="preserve">The File System implementations each independently manage their own CSV file, with in-memory caching invalidated based on the last-modified timestamp, and an explicit lock for write concurrency: there is no CsvHelper class shared among the three implementations.</w:t>
+        <w:t xml:space="preserve">The File System implementations each independently manage their own CSV file, with in-memory caching invalidated based on the last-modified timestamp (and discarded after a failed write, so that it is reloaded from the file, which remains the source of truth), and an explicit lock for write concurrency: there is no CsvHelper class shared among the three implementations.</w:t>
       </w:r>
     </w:p>
     <w:p>
@@ -2453,7 +2466,7 @@
       <w:r>
         <w:drawing>
           <wp:inline distT="0" distB="0" distL="0" distR="0">
-            <wp:extent cx="5334000" cy="5061029"/>
+            <wp:extent cx="5334000" cy="6123214"/>
             <wp:effectExtent t="0" r="0" b="0" l="0"/>
             <wp:docPr id="1" name="" descr="" title=""/>
             <wp:cNvGraphicFramePr>
@@ -2478,7 +2491,7 @@
                   <pic:spPr bwMode="auto">
                     <a:xfrm>
                       <a:off x="0" y="0"/>
-                      <a:ext cx="5334000" cy="5061029"/>
+                      <a:ext cx="5334000" cy="6123214"/>
                     </a:xfrm>
                     <a:prstGeom prst="rect">
                       <a:avLst/>
@@ -2512,7 +2525,7 @@
         <w:spacing w:after="160"/>
       </w:pPr>
       <w:r>
-        <w:t xml:space="preserve">On the left, Ride plays the role of Subject and keeps a list of Observer references without knowing their concrete type (in the code, an observer is often a simple lambda registered by the Controller at request time). On the right, SearchRideController dynamically chooses which CostStrategy to apply based on Config.COST_STRATEGY_TYPE, allowing a new pricing model to be added without touching the existing code.</w:t>
+        <w:t xml:space="preserve">On the left, Ride plays the role of Subject and keeps a list of Observer references without knowing their concrete type (in the code, ManageRidesController registers a PassengerBookingObserver for each booking before cancelling the ride, while the observer registered at request time is a simple lambda that only logs the event). On the right, SearchRideController dynamically chooses which CostStrategy to apply based on Config.COST_STRATEGY_TYPE, allowing a new pricing model to be added without touching the existing code.</w:t>
       </w:r>
     </w:p>
     <w:p>
@@ -2541,7 +2554,7 @@
         <w:spacing w:after="160"/>
       </w:pPr>
       <w:r>
-        <w:t xml:space="preserve">The system implements the Abstract Factory Pattern, whose main purpose is to provide an interface for creating families of related objects without specifying their concrete classes. DAOFactory is an abstract class that exposes three factory methods: getRideDAO(), getStudentDAO() and getBookingDAO(). Three concrete subclasses extend it and instantiate the correct implementations based on the value of Config.PERSISTENCE_TYPE: MemoryDAOFactory (in-RAM HashMap), FsDAOFactory (CSV files) and SqlDAOFactory (relational H2 database via JDBC). Thanks to this design, switching the entire application from one persistence technology to another requires changing a single constant, and no Controller class is aware of which technology is actually storing the data.</w:t>
+        <w:t xml:space="preserve">The system implements the Abstract Factory Pattern, whose main purpose is to provide an interface for creating families of related objects without specifying their concrete classes. DAOFactory is an abstract class that exposes three factory methods: getRideDAO(), getStudentDAO() and getBookingDAO(). Three concrete subclasses extend it and instantiate the correct implementations based on the value of Config.PERSISTENCE_TYPE: MemoryDAOFactory (in-RAM HashMap), FsDAOFactory (CSV files) and SqlDAOFactory (relational H2 database via JDBC). Thanks to this design, switching the entire application from one persistence technology to another requires changing a single setting (the uniride.persistence system property), and no Controller class is aware of which technology is actually storing the data.</w:t>
       </w:r>
     </w:p>
     <w:p>
@@ -2581,7 +2594,7 @@
         <w:spacing w:after="160"/>
       </w:pPr>
       <w:r>
-        <w:t xml:space="preserve">The State Pattern models the lifecycle of a ride. The RideState interface defines the four concrete states a Ride can take on (AvailableState, FullState, CompletedState, CancelledState), and every transition is triggered exclusively by a method on Ride itself (bookSeat, cancelSeat, complete, cancel), so the state field can never diverge from the actual number of available seats or from disallowed transitions (the two terminal states, COMPLETED and CANCELLED, reject any further transition). The Booking entity instead adopts a lighter approach: a textual state with transitions validated directly by its own confirm()/reject()/cancel() methods, without a dedicated State class hierarchy.</w:t>
+        <w:t xml:space="preserve">The State Pattern models the lifecycle of a ride. The RideState interface defines the four concrete states a Ride can take on (AvailableState, FullState, CompletedState, CancelledState), and every transition is triggered exclusively by a method on Ride itself (bookSeat, cancelSeat, complete, cancel), so the state field can never diverge from the actual number of available seats or from disallowed transitions (the two terminal states, COMPLETED and CANCELLED, reject any further transition). The Booking entity instead adopts a lighter approach: a textual state with transitions validated directly by its own confirm()/reject()/cancel() methods, without a dedicated State class hierarchy. The static RideState.fromStatus(String) method, shared by the File System and SQL DAOs, rebuilds the concrete state from the label stored on disk, logging any unrecognized value instead of silently ignoring it.</w:t>
       </w:r>
     </w:p>
     <w:p>
@@ -2621,7 +2634,7 @@
         <w:spacing w:after="160"/>
       </w:pPr>
       <w:r>
-        <w:t xml:space="preserve">The Observer Pattern defines a one-to-many dependency so that, when an object changes state, all its dependents are automatically notified. Ride keeps a list of Observer instances and invokes notifyObservers() whenever a seat is requested, freed, or the ride is cancelled. In the prototype, the Observer registered when a seat is requested is typically a lambda function that logs the notification via LoggerCustom.</w:t>
+        <w:t xml:space="preserve">The Observer Pattern defines a one-to-many dependency so that, when an object changes state, all its dependents are automatically notified. Ride keeps a list of Observer instances and invokes notifyObservers() whenever a seat is requested, freed, or the ride is cancelled. When the driver cancels a ride, ManageRidesController attaches a PassengerBookingObserver for every booking on that ride: the notification sent by Ride.cancel() moves each booking to CANCELLED, so the passenger no longer sees it as pending or confirmed, and the Controller persists the bookings only after the ride itself has been saved. The observers are recreated on every call, because the list of subscribers lives only in memory and is not persisted by the DAOs, whereas the bookings are. The Observer registered when a seat is requested remains a lambda that logs the notification via LoggerCustom.</w:t>
       </w:r>
     </w:p>
     <w:p>
@@ -3298,6 +3311,102 @@
                 <w:szCs w:val="20"/>
               </w:rPr>
               <w:t xml:space="preserve">verifies that SqlDAOFactory actually returns the Jdbc*DAO implementations and not a stub</w:t>
+            </w:r>
+          </w:p>
+        </w:tc>
+      </w:tr>
+      <w:tr>
+        <w:tc>
+          <w:tcPr>
+            <w:tcW w:type="pct" w:w="35%"/>
+            <w:tcMar>
+              <w:top w:type="dxa" w:w="80"/>
+              <w:left w:type="dxa" w:w="120"/>
+              <w:bottom w:type="dxa" w:w="80"/>
+              <w:right w:type="dxa" w:w="120"/>
+            </w:tcMar>
+            <w:vAlign w:val="center"/>
+          </w:tcPr>
+          <w:p>
+            <w:r>
+              <w:rPr>
+                <w:b w:val="false"/>
+                <w:bCs w:val="false"/>
+                <w:sz w:val="20"/>
+                <w:szCs w:val="20"/>
+              </w:rPr>
+              <w:t xml:space="preserve">PasswordHasherTest</w:t>
+            </w:r>
+          </w:p>
+        </w:tc>
+        <w:tc>
+          <w:tcPr>
+            <w:tcW w:type="pct" w:w="65%"/>
+            <w:tcMar>
+              <w:top w:type="dxa" w:w="80"/>
+              <w:left w:type="dxa" w:w="120"/>
+              <w:bottom w:type="dxa" w:w="80"/>
+              <w:right w:type="dxa" w:w="120"/>
+            </w:tcMar>
+            <w:vAlign w:val="center"/>
+          </w:tcPr>
+          <w:p>
+            <w:r>
+              <w:rPr>
+                <w:b w:val="false"/>
+                <w:bCs w:val="false"/>
+                <w:sz w:val="20"/>
+                <w:szCs w:val="20"/>
+              </w:rPr>
+              <w:t xml:space="preserve">a password verifies only against its own PBKDF2 hash; two hashes of the same password differ (random salt); the legacy format is still accepted and corrupted values are rejected; the demo user can log in</w:t>
+            </w:r>
+          </w:p>
+        </w:tc>
+      </w:tr>
+      <w:tr>
+        <w:tc>
+          <w:tcPr>
+            <w:tcW w:type="pct" w:w="35%"/>
+            <w:tcMar>
+              <w:top w:type="dxa" w:w="80"/>
+              <w:left w:type="dxa" w:w="120"/>
+              <w:bottom w:type="dxa" w:w="80"/>
+              <w:right w:type="dxa" w:w="120"/>
+            </w:tcMar>
+            <w:vAlign w:val="center"/>
+          </w:tcPr>
+          <w:p>
+            <w:r>
+              <w:rPr>
+                <w:b w:val="false"/>
+                <w:bCs w:val="false"/>
+                <w:sz w:val="20"/>
+                <w:szCs w:val="20"/>
+              </w:rPr>
+              <w:t xml:space="preserve">CompensationTest</w:t>
+            </w:r>
+          </w:p>
+        </w:tc>
+        <w:tc>
+          <w:tcPr>
+            <w:tcW w:type="pct" w:w="65%"/>
+            <w:tcMar>
+              <w:top w:type="dxa" w:w="80"/>
+              <w:left w:type="dxa" w:w="120"/>
+              <w:bottom w:type="dxa" w:w="80"/>
+              <w:right w:type="dxa" w:w="120"/>
+            </w:tcMar>
+            <w:vAlign w:val="center"/>
+          </w:tcPr>
+          <w:p>
+            <w:r>
+              <w:rPr>
+                <w:b w:val="false"/>
+                <w:bCs w:val="false"/>
+                <w:sz w:val="20"/>
+                <w:szCs w:val="20"/>
+              </w:rPr>
+              <w:t xml:space="preserve">with a simulated failure of the BookingDAO, a booking request does not consume the seat: the change already written to the Ride is undone</w:t>
             </w:r>
           </w:p>
         </w:tc>

</xml_diff>

<commit_message>
Documentazione: ridisegnati i diagrammi delle DAO e la vista dei package
- Fig. 4 (DAOFactory): aggiunti setInstance e resolvePersistenceType, nota
  sulla proprietà uniride.persistence; etichette in inglese.
- Fig. 5-7 (DAO In-Memory, File System, SQL) allineate al codice attuale:
  generici espliciti, cache AtomicReference e metodi reali delle Fs*DAO,
  inTransaction/loadPassengers nelle Jdbc*DAO, JdbcSupport.ensureSchema;
  note ed etichette in inglese, JdbcSupport non più colorata come un Bean.
- Fig. 8 (vista dei package): aggiunto il livello Bean, mancante; etichette
  in inglese e nessuna sovrapposizione.
- Sorgenti Mermaid in docs/diagrams/; indici aggiornati, PDF rigenerato.

Co-Authored-By: Claude Opus 5.5 <noreply@anthropic.com>
</commit_message>
<xml_diff>
--- a/docs/UniRide_Submission.docx
+++ b/docs/UniRide_Submission.docx
@@ -193,7 +193,7 @@
       <w:r>
         <w:t xml:space="preserve">3.2. Class Diagram — Design Level</w:t>
         <w:ptab w:alignment="right" w:relativeTo="margin" w:leader="dot"/>
-        <w:t xml:space="preserve">15</w:t>
+        <w:t xml:space="preserve">14</w:t>
       </w:r>
     </w:p>
     <w:p>
@@ -204,7 +204,7 @@
       <w:r>
         <w:t xml:space="preserve">3.3. Design Patterns</w:t>
         <w:ptab w:alignment="right" w:relativeTo="margin" w:leader="dot"/>
-        <w:t xml:space="preserve">16</w:t>
+        <w:t xml:space="preserve">15</w:t>
       </w:r>
     </w:p>
     <w:p>
@@ -215,7 +215,7 @@
       <w:r>
         <w:t xml:space="preserve">3.4. Activity Diagram</w:t>
         <w:ptab w:alignment="right" w:relativeTo="margin" w:leader="dot"/>
-        <w:t xml:space="preserve">17</w:t>
+        <w:t xml:space="preserve">16</w:t>
       </w:r>
     </w:p>
     <w:p>
@@ -226,7 +226,7 @@
       <w:r>
         <w:t xml:space="preserve">3.5. Sequence Diagram</w:t>
         <w:ptab w:alignment="right" w:relativeTo="margin" w:leader="dot"/>
-        <w:t xml:space="preserve">19</w:t>
+        <w:t xml:space="preserve">18</w:t>
       </w:r>
     </w:p>
     <w:p>
@@ -237,7 +237,7 @@
       <w:r>
         <w:t xml:space="preserve">3.6. State Diagram</w:t>
         <w:ptab w:alignment="right" w:relativeTo="margin" w:leader="dot"/>
-        <w:t xml:space="preserve">19</w:t>
+        <w:t xml:space="preserve">18</w:t>
       </w:r>
     </w:p>
     <w:p>
@@ -248,7 +248,7 @@
       <w:r>
         <w:t xml:space="preserve">4. TESTING</w:t>
         <w:ptab w:alignment="right" w:relativeTo="margin" w:leader="dot"/>
-        <w:t xml:space="preserve">20</w:t>
+        <w:t xml:space="preserve">19</w:t>
       </w:r>
     </w:p>
     <w:p>
@@ -259,7 +259,7 @@
       <w:r>
         <w:t xml:space="preserve">DELIVERABLE LINKS</w:t>
         <w:ptab w:alignment="right" w:relativeTo="margin" w:leader="dot"/>
-        <w:t xml:space="preserve">21</w:t>
+        <w:t xml:space="preserve">20</w:t>
       </w:r>
     </w:p>
     <w:p>
@@ -2207,7 +2207,7 @@
       <w:r>
         <w:drawing>
           <wp:inline distT="0" distB="0" distL="0" distR="0">
-            <wp:extent cx="5334000" cy="3638550"/>
+            <wp:extent cx="5715000" cy="1785938"/>
             <wp:effectExtent t="0" r="0" b="0" l="0"/>
             <wp:docPr id="1" name="" descr="" title=""/>
             <wp:cNvGraphicFramePr>
@@ -2232,7 +2232,7 @@
                   <pic:spPr bwMode="auto">
                     <a:xfrm>
                       <a:off x="0" y="0"/>
-                      <a:ext cx="5334000" cy="3638550"/>
+                      <a:ext cx="5715000" cy="1785938"/>
                     </a:xfrm>
                     <a:prstGeom prst="rect">
                       <a:avLst/>
@@ -2289,7 +2289,7 @@
       <w:r>
         <w:drawing>
           <wp:inline distT="0" distB="0" distL="0" distR="0">
-            <wp:extent cx="5715000" cy="3571875"/>
+            <wp:extent cx="5486400" cy="3470988"/>
             <wp:effectExtent t="0" r="0" b="0" l="0"/>
             <wp:docPr id="1" name="" descr="" title=""/>
             <wp:cNvGraphicFramePr>
@@ -2314,7 +2314,7 @@
                   <pic:spPr bwMode="auto">
                     <a:xfrm>
                       <a:off x="0" y="0"/>
-                      <a:ext cx="5715000" cy="3571875"/>
+                      <a:ext cx="5486400" cy="3470988"/>
                     </a:xfrm>
                     <a:prstGeom prst="rect">
                       <a:avLst/>
@@ -2371,7 +2371,7 @@
       <w:r>
         <w:drawing>
           <wp:inline distT="0" distB="0" distL="0" distR="0">
-            <wp:extent cx="5715000" cy="1581150"/>
+            <wp:extent cx="5715000" cy="1698463"/>
             <wp:effectExtent t="0" r="0" b="0" l="0"/>
             <wp:docPr id="1" name="" descr="" title=""/>
             <wp:cNvGraphicFramePr>
@@ -2396,7 +2396,7 @@
                   <pic:spPr bwMode="auto">
                     <a:xfrm>
                       <a:off x="0" y="0"/>
-                      <a:ext cx="5715000" cy="1581150"/>
+                      <a:ext cx="5715000" cy="1698463"/>
                     </a:xfrm>
                     <a:prstGeom prst="rect">
                       <a:avLst/>
@@ -2453,7 +2453,7 @@
       <w:r>
         <w:drawing>
           <wp:inline distT="0" distB="0" distL="0" distR="0">
-            <wp:extent cx="5715000" cy="1876425"/>
+            <wp:extent cx="5715000" cy="1960886"/>
             <wp:effectExtent t="0" r="0" b="0" l="0"/>
             <wp:docPr id="1" name="" descr="" title=""/>
             <wp:cNvGraphicFramePr>
@@ -2478,7 +2478,7 @@
                   <pic:spPr bwMode="auto">
                     <a:xfrm>
                       <a:off x="0" y="0"/>
-                      <a:ext cx="5715000" cy="1876425"/>
+                      <a:ext cx="5715000" cy="1960886"/>
                     </a:xfrm>
                     <a:prstGeom prst="rect">
                       <a:avLst/>
@@ -2535,7 +2535,7 @@
       <w:r>
         <w:drawing>
           <wp:inline distT="0" distB="0" distL="0" distR="0">
-            <wp:extent cx="5715000" cy="6162675"/>
+            <wp:extent cx="5715000" cy="2376390"/>
             <wp:effectExtent t="0" r="0" b="0" l="0"/>
             <wp:docPr id="1" name="" descr="" title=""/>
             <wp:cNvGraphicFramePr>
@@ -2560,7 +2560,7 @@
                   <pic:spPr bwMode="auto">
                     <a:xfrm>
                       <a:off x="0" y="0"/>
-                      <a:ext cx="5715000" cy="6162675"/>
+                      <a:ext cx="5715000" cy="2376390"/>
                     </a:xfrm>
                     <a:prstGeom prst="rect">
                       <a:avLst/>

</xml_diff>

<commit_message>
Documentazione: Use Case Diagram con attori secondari ed esterni, VOPC verticale
- Fig. 1: attore principale Student, attori secondari Driver e Passenger
  (generalizzazione di Student), attori esterni «system» DBMS (H2) e File
  System (CSV) collegati ai casi d'uso che salvano dati; paragrafo che
  descrive i ruoli degli attori. Sorgente: docs/diagrams/fig01-use-case.svg.
- Fig. 2: VOPC di Request Booking disegnato dall'alto verso il basso
  nell'ordine Boundary, Bean, Control, Entity, solo con le classi del caso
  d'uso (nessun DAO). Sorgente HTML/SVG al posto del vecchio .mmd.
- PDF di consegna rigenerato; impaginazione invariata.

Co-Authored-By: Claude Opus 5.5 <noreply@anthropic.com>
</commit_message>
<xml_diff>
--- a/docs/UniRide_Submission.docx
+++ b/docs/UniRide_Submission.docx
@@ -1451,7 +1451,7 @@
       <w:r>
         <w:drawing>
           <wp:inline distT="0" distB="0" distL="0" distR="0">
-            <wp:extent cx="5715000" cy="4497705"/>
+            <wp:extent cx="5715000" cy="3924759"/>
             <wp:effectExtent t="0" r="0" b="0" l="0"/>
             <wp:docPr id="1" name="" descr="" title=""/>
             <wp:cNvGraphicFramePr>
@@ -1476,7 +1476,7 @@
                   <pic:spPr bwMode="auto">
                     <a:xfrm>
                       <a:off x="0" y="0"/>
-                      <a:ext cx="5715000" cy="4497705"/>
+                      <a:ext cx="5715000" cy="3924759"/>
                     </a:xfrm>
                     <a:prstGeom prst="rect">
                       <a:avLst/>
@@ -1502,7 +1502,15 @@
           <w:sz w:val="20"/>
           <w:szCs w:val="20"/>
         </w:rPr>
-        <w:t xml:space="preserve">Figure 1 — Use case diagram, Student actor</w:t>
+        <w:t xml:space="preserve">Figure 1 — Use case diagram: primary, secondary and external actors</w:t>
+      </w:r>
+    </w:p>
+    <w:p>
+      <w:pPr>
+        <w:spacing w:after="160"/>
+      </w:pPr>
+      <w:r>
+        <w:t xml:space="preserve">The primary actor is the Student, who registers and logs in. Driver and Passenger are secondary actors that specialize the Student (generalization): the Driver offers rides, the Passenger searches for them and requests a seat, and both manage their rides and bookings in My Rides, inherited from the Student. The DBMS (H2) and the File System (CSV) are external actors: they are the systems on which UniRide persists users, rides and bookings in the full version of the application, and they take part in every use case that writes data.</w:t>
       </w:r>
     </w:p>
     <w:p>
@@ -2117,7 +2125,7 @@
       <w:r>
         <w:drawing>
           <wp:inline distT="0" distB="0" distL="0" distR="0">
-            <wp:extent cx="5715000" cy="3520848"/>
+            <wp:extent cx="5029200" cy="5518435"/>
             <wp:effectExtent t="0" r="0" b="0" l="0"/>
             <wp:docPr id="902" name="" descr="" title=""/>
             <wp:cNvGraphicFramePr>
@@ -2142,7 +2150,7 @@
                   <pic:spPr bwMode="auto">
                     <a:xfrm>
                       <a:off x="0" y="0"/>
-                      <a:ext cx="5715000" cy="3520848"/>
+                      <a:ext cx="5029200" cy="5518435"/>
                     </a:xfrm>
                     <a:prstGeom prst="rect">
                       <a:avLst/>
@@ -2176,7 +2184,7 @@
         <w:spacing w:after="160"/>
       </w:pPr>
       <w:r>
-        <w:t xml:space="preserve">SearchRideBoundary collects the route and the selected ride and invokes SearchRideController, which realizes the internal steps of the use case: it reads the logged-in student from the Session, lets RequestExpiry expire the requests left unanswered for 24 hours, checks that the requester is not the driver and has no active request, reserves the seat on Ride (State Pattern), creates the Booking and persists both through the RideDAO and BookingDAO interfaces. Results travel back to the Boundary only as RideBean objects, never as Entities.</w:t>
+        <w:t xml:space="preserve">The VOPC is drawn top to bottom in the order of the BCE layers — Boundary, Bean, Control and Entity — and contains only the classes that take part in the Request Booking use case. SearchRideBoundary collects the route and the selected ride and invokes SearchRideController, which realizes the internal steps of the use case: it reads the logged-in student from the Session, lets RequestExpiry expire the requests left unanswered for 24 hours, checks that the requester is not the driver and has no active request, reserves the seat on Ride (State Pattern) and creates the Booking. Results travel back to the Boundary only as RideBean objects, never as Entities. Persistence goes through the DAO layer, deliberately left out of the VOPC and illustrated in Figures 4–7.</w:t>
       </w:r>
     </w:p>
     <w:p>

</xml_diff>